<commit_message>
Refine D7 figures to Nature publication standard
</commit_message>
<xml_diff>
--- a/Project 1 Data Quality Assessment/D7 Topological Role Consistency and Structural Representativeness/outputs/reports/D7_EXPERT_REPORT_v2.1.docx
+++ b/Project 1 Data Quality Assessment/D7 Topological Role Consistency and Structural Representativeness/outputs/reports/D7_EXPERT_REPORT_v2.1.docx
@@ -1732,7 +1732,7 @@
       <w:r>
         <w:drawing>
           <wp:inline xmlns:a="http://schemas.openxmlformats.org/drawingml/2006/main" xmlns:pic="http://schemas.openxmlformats.org/drawingml/2006/picture">
-            <wp:extent cx="5623560" cy="2036749"/>
+            <wp:extent cx="5623560" cy="2827394"/>
             <wp:docPr id="1" name="Picture 1" descr="Figure D7-1 | Declared topology, applicability and release boundary."/>
             <wp:cNvGraphicFramePr>
               <a:graphicFrameLocks noChangeAspect="1"/>
@@ -1753,7 +1753,7 @@
                   <pic:spPr>
                     <a:xfrm>
                       <a:off x="0" y="0"/>
-                      <a:ext cx="5623560" cy="2036749"/>
+                      <a:ext cx="5623560" cy="2827394"/>
                     </a:xfrm>
                     <a:prstGeom prst="rect"/>
                   </pic:spPr>
@@ -1787,7 +1787,7 @@
       <w:r>
         <w:drawing>
           <wp:inline xmlns:a="http://schemas.openxmlformats.org/drawingml/2006/main" xmlns:pic="http://schemas.openxmlformats.org/drawingml/2006/picture">
-            <wp:extent cx="5623560" cy="4010055"/>
+            <wp:extent cx="5623560" cy="3748606"/>
             <wp:docPr id="2" name="Picture 2" descr="Figure D7-2 | Spatiotemporal D7 structure and effective support."/>
             <wp:cNvGraphicFramePr>
               <a:graphicFrameLocks noChangeAspect="1"/>
@@ -1808,7 +1808,7 @@
                   <pic:spPr>
                     <a:xfrm>
                       <a:off x="0" y="0"/>
-                      <a:ext cx="5623560" cy="4010055"/>
+                      <a:ext cx="5623560" cy="3748606"/>
                     </a:xfrm>
                     <a:prstGeom prst="rect"/>
                   </pic:spPr>
@@ -1842,7 +1842,7 @@
       <w:r>
         <w:drawing>
           <wp:inline xmlns:a="http://schemas.openxmlformats.org/drawingml/2006/main" xmlns:pic="http://schemas.openxmlformats.org/drawingml/2006/picture">
-            <wp:extent cx="5623560" cy="3932264"/>
+            <wp:extent cx="5623560" cy="3687452"/>
             <wp:docPr id="3" name="Picture 3" descr="Figure D7-3 | Evidence decomposition, node influence and zone consensus."/>
             <wp:cNvGraphicFramePr>
               <a:graphicFrameLocks noChangeAspect="1"/>
@@ -1863,7 +1863,7 @@
                   <pic:spPr>
                     <a:xfrm>
                       <a:off x="0" y="0"/>
-                      <a:ext cx="5623560" cy="3932264"/>
+                      <a:ext cx="5623560" cy="3687452"/>
                     </a:xfrm>
                     <a:prstGeom prst="rect"/>
                   </pic:spPr>
@@ -1897,7 +1897,7 @@
       <w:r>
         <w:drawing>
           <wp:inline xmlns:a="http://schemas.openxmlformats.org/drawingml/2006/main" xmlns:pic="http://schemas.openxmlformats.org/drawingml/2006/picture">
-            <wp:extent cx="5623560" cy="4239772"/>
+            <wp:extent cx="5623560" cy="4456431"/>
             <wp:docPr id="4" name="Picture 4" descr="Figure D7-4 | Validation and Local-Sensitivity invariance."/>
             <wp:cNvGraphicFramePr>
               <a:graphicFrameLocks noChangeAspect="1"/>
@@ -1918,7 +1918,7 @@
                   <pic:spPr>
                     <a:xfrm>
                       <a:off x="0" y="0"/>
-                      <a:ext cx="5623560" cy="4239772"/>
+                      <a:ext cx="5623560" cy="4456431"/>
                     </a:xfrm>
                     <a:prstGeom prst="rect"/>
                   </pic:spPr>
@@ -1952,7 +1952,7 @@
       <w:r>
         <w:drawing>
           <wp:inline xmlns:a="http://schemas.openxmlformats.org/drawingml/2006/main" xmlns:pic="http://schemas.openxmlformats.org/drawingml/2006/picture">
-            <wp:extent cx="5623560" cy="4316649"/>
+            <wp:extent cx="5623560" cy="4548812"/>
             <wp:docPr id="5" name="Picture 5" descr="Figure D7-5 | Support, regime, topology and release governance."/>
             <wp:cNvGraphicFramePr>
               <a:graphicFrameLocks noChangeAspect="1"/>
@@ -1973,7 +1973,7 @@
                   <pic:spPr>
                     <a:xfrm>
                       <a:off x="0" y="0"/>
-                      <a:ext cx="5623560" cy="4316649"/>
+                      <a:ext cx="5623560" cy="4548812"/>
                     </a:xfrm>
                     <a:prstGeom prst="rect"/>
                   </pic:spPr>
@@ -1997,6 +1997,11 @@
           <w:sz w:val="17"/>
         </w:rPr>
         <w:t>Figure D7-5 | Support, regime, topology and release governance.</w:t>
+      </w:r>
+    </w:p>
+    <w:p>
+      <w:r>
+        <w:br w:type="page"/>
       </w:r>
     </w:p>
     <w:p>
@@ -2190,7 +2195,7 @@
         <w:color w:val="5F6B73"/>
         <w:sz w:val="16"/>
       </w:rPr>
-      <w:t>Generated 2026-07-16 21:19 CST | Research review only</w:t>
+      <w:t>Generated 2026-07-17 10:06 CST | Research review only</w:t>
     </w:r>
   </w:p>
 </w:ftr>

</xml_diff>

<commit_message>
Release D1 and refresh dependent quality modules
</commit_message>
<xml_diff>
--- a/Project 1 Data Quality Assessment/D7 Topological Role Consistency and Structural Representativeness/outputs/reports/D7_EXPERT_REPORT_v2.1.docx
+++ b/Project 1 Data Quality Assessment/D7 Topological Role Consistency and Structural Representativeness/outputs/reports/D7_EXPERT_REPORT_v2.1.docx
@@ -209,6 +209,16 @@
       </w:pPr>
       <w:r>
         <w:t>3. Current data and outputs</w:t>
+      </w:r>
+    </w:p>
+    <w:p>
+      <w:r>
+        <w:rPr>
+          <w:rFonts w:ascii="Arial" w:hAnsi="Arial" w:eastAsia="Microsoft YaHei"/>
+          <w:color w:val="25282A"/>
+          <w:sz w:val="21"/>
+        </w:rPr>
+        <w:t>Sensitivity provenance is bound to frozen D1 release D1REL-1.3.0-f6074be3751f and exact D2/D4/Local artifact hashes. Production arbitration remains pending_not_produced; no D7_forDQR output was generated.</w:t>
       </w:r>
     </w:p>
     <w:tbl>
@@ -1470,7 +1480,7 @@
                 <w:color w:val="25282A"/>
                 <w:sz w:val="17"/>
               </w:rPr>
-              <w:t>0.041</w:t>
+              <w:t>0.039</w:t>
             </w:r>
           </w:p>
         </w:tc>
@@ -1539,7 +1549,7 @@
                 <w:color w:val="25282A"/>
                 <w:sz w:val="17"/>
               </w:rPr>
-              <w:t>0.844</w:t>
+              <w:t>0.851</w:t>
             </w:r>
           </w:p>
         </w:tc>
@@ -2190,7 +2200,7 @@
         <w:color w:val="5F6B73"/>
         <w:sz w:val="16"/>
       </w:rPr>
-      <w:t>Generated 2026-07-16 21:19 CST | Research review only</w:t>
+      <w:t>Generated 2026-07-22 10:29 CST | Research review only</w:t>
     </w:r>
   </w:p>
 </w:ftr>

</xml_diff>

<commit_message>
Fix D2 process-floor QFA and refresh downstream outputs
</commit_message>
<xml_diff>
--- a/Project 1 Data Quality Assessment/D7 Topological Role Consistency and Structural Representativeness/outputs/reports/D7_EXPERT_REPORT_v2.1.docx
+++ b/Project 1 Data Quality Assessment/D7 Topological Role Consistency and Structural Representativeness/outputs/reports/D7_EXPERT_REPORT_v2.1.docx
@@ -1480,7 +1480,7 @@
                 <w:color w:val="25282A"/>
                 <w:sz w:val="17"/>
               </w:rPr>
-              <w:t>0.039</w:t>
+              <w:t>0.043</w:t>
             </w:r>
           </w:p>
         </w:tc>
@@ -1549,7 +1549,7 @@
                 <w:color w:val="25282A"/>
                 <w:sz w:val="17"/>
               </w:rPr>
-              <w:t>0.851</w:t>
+              <w:t>0.839</w:t>
             </w:r>
           </w:p>
         </w:tc>
@@ -1618,7 +1618,7 @@
                 <w:color w:val="25282A"/>
                 <w:sz w:val="17"/>
               </w:rPr>
-              <w:t>0.978</w:t>
+              <w:t>0.979</w:t>
             </w:r>
           </w:p>
         </w:tc>
@@ -2200,7 +2200,7 @@
         <w:color w:val="5F6B73"/>
         <w:sz w:val="16"/>
       </w:rPr>
-      <w:t>Generated 2026-07-22 10:29 CST | Research review only</w:t>
+      <w:t>Generated 2026-07-22 17:24 CST | Research review only</w:t>
     </w:r>
   </w:p>
 </w:ftr>

</xml_diff>

<commit_message>
Align D7 regimes and aggregation readiness
</commit_message>
<xml_diff>
--- a/Project 1 Data Quality Assessment/D7 Topological Role Consistency and Structural Representativeness/outputs/reports/D7_EXPERT_REPORT_v2.1.docx
+++ b/Project 1 Data Quality Assessment/D7 Topological Role Consistency and Structural Representativeness/outputs/reports/D7_EXPERT_REPORT_v2.1.docx
@@ -70,7 +70,7 @@
           <w:color w:val="25282A"/>
           <w:sz w:val="19"/>
         </w:rPr>
-        <w:t>D7-LOCAL-20260716T125319Z</w:t>
+        <w:t>D7-LOCAL-20260726T020233Z</w:t>
       </w:r>
     </w:p>
     <w:p>
@@ -131,7 +131,7 @@
           <w:color w:val="8B2E2E"/>
           <w:sz w:val="21"/>
         </w:rPr>
-        <w:t>Production release is blocked: topology/asset identity is unverified, 53 of 56 templates remain L1, and swap Top-1 is 0.75 versus the 0.80 target. D7_total, D7_forDQR and D6 final arbitration therefore remain empty.</w:t>
+        <w:t>Production release is blocked: topology/asset identity is unverified; support is L1=48, L2=8, L3=0; swap Top-1 is 0.70 (95% CI 0.57-0.80, n=60). D7_total, D7_forDQR and D6 final arbitration therefore remain empty.</w:t>
       </w:r>
     </w:p>
     <w:p>
@@ -379,7 +379,7 @@
                 <w:color w:val="25282A"/>
                 <w:sz w:val="17"/>
               </w:rPr>
-              <w:t>mean 3.155; median 3.186</w:t>
+              <w:t>mean 3.097; median 3.114</w:t>
             </w:r>
           </w:p>
         </w:tc>
@@ -432,7 +432,7 @@
                 <w:color w:val="25282A"/>
                 <w:sz w:val="17"/>
               </w:rPr>
-              <w:t>43.8%</w:t>
+              <w:t>46.0%</w:t>
             </w:r>
           </w:p>
         </w:tc>
@@ -485,7 +485,7 @@
                 <w:color w:val="25282A"/>
                 <w:sz w:val="17"/>
               </w:rPr>
-              <w:t>499</w:t>
+              <w:t>529</w:t>
             </w:r>
           </w:p>
         </w:tc>
@@ -538,7 +538,7 @@
                 <w:color w:val="25282A"/>
                 <w:sz w:val="17"/>
               </w:rPr>
-              <w:t>17.1%</w:t>
+              <w:t>15.5%</w:t>
             </w:r>
           </w:p>
         </w:tc>
@@ -731,7 +731,7 @@
                 <w:color w:val="25282A"/>
                 <w:sz w:val="17"/>
               </w:rPr>
-              <w:t>53</w:t>
+              <w:t>48</w:t>
             </w:r>
           </w:p>
         </w:tc>
@@ -784,7 +784,7 @@
                 <w:color w:val="25282A"/>
                 <w:sz w:val="17"/>
               </w:rPr>
-              <w:t>3</w:t>
+              <w:t>8</w:t>
             </w:r>
           </w:p>
         </w:tc>
@@ -958,7 +958,7 @@
                 <w:color w:val="25282A"/>
                 <w:sz w:val="17"/>
               </w:rPr>
-              <w:t>0.917</w:t>
+              <w:t>0.912</w:t>
             </w:r>
           </w:p>
         </w:tc>
@@ -1027,7 +1027,7 @@
                 <w:color w:val="25282A"/>
                 <w:sz w:val="17"/>
               </w:rPr>
-              <w:t>0.928</w:t>
+              <w:t>0.870</w:t>
             </w:r>
           </w:p>
         </w:tc>
@@ -1096,7 +1096,7 @@
                 <w:color w:val="25282A"/>
                 <w:sz w:val="17"/>
               </w:rPr>
-              <w:t>0.750</w:t>
+              <w:t>0.700</w:t>
             </w:r>
           </w:p>
         </w:tc>
@@ -1165,7 +1165,7 @@
                 <w:color w:val="25282A"/>
                 <w:sz w:val="17"/>
               </w:rPr>
-              <w:t>0.061</w:t>
+              <w:t>0.046</w:t>
             </w:r>
           </w:p>
         </w:tc>
@@ -1234,7 +1234,7 @@
                 <w:color w:val="25282A"/>
                 <w:sz w:val="17"/>
               </w:rPr>
-              <w:t>0.039</w:t>
+              <w:t>0.057</w:t>
             </w:r>
           </w:p>
         </w:tc>
@@ -1480,7 +1480,7 @@
                 <w:color w:val="25282A"/>
                 <w:sz w:val="17"/>
               </w:rPr>
-              <w:t>0.043</w:t>
+              <w:t>0.048</w:t>
             </w:r>
           </w:p>
         </w:tc>
@@ -1549,7 +1549,7 @@
                 <w:color w:val="25282A"/>
                 <w:sz w:val="17"/>
               </w:rPr>
-              <w:t>0.839</w:t>
+              <w:t>0.825</w:t>
             </w:r>
           </w:p>
         </w:tc>
@@ -1618,7 +1618,7 @@
                 <w:color w:val="25282A"/>
                 <w:sz w:val="17"/>
               </w:rPr>
-              <w:t>0.979</w:t>
+              <w:t>0.962</w:t>
             </w:r>
           </w:p>
         </w:tc>
@@ -1742,7 +1742,7 @@
       <w:r>
         <w:drawing>
           <wp:inline xmlns:a="http://schemas.openxmlformats.org/drawingml/2006/main" xmlns:pic="http://schemas.openxmlformats.org/drawingml/2006/picture">
-            <wp:extent cx="5623560" cy="2036749"/>
+            <wp:extent cx="5623560" cy="2203810"/>
             <wp:docPr id="1" name="Picture 1" descr="Figure D7-1 | Declared topology, applicability and release boundary."/>
             <wp:cNvGraphicFramePr>
               <a:graphicFrameLocks noChangeAspect="1"/>
@@ -1763,7 +1763,7 @@
                   <pic:spPr>
                     <a:xfrm>
                       <a:off x="0" y="0"/>
-                      <a:ext cx="5623560" cy="2036749"/>
+                      <a:ext cx="5623560" cy="2203810"/>
                     </a:xfrm>
                     <a:prstGeom prst="rect"/>
                   </pic:spPr>
@@ -1797,7 +1797,7 @@
       <w:r>
         <w:drawing>
           <wp:inline xmlns:a="http://schemas.openxmlformats.org/drawingml/2006/main" xmlns:pic="http://schemas.openxmlformats.org/drawingml/2006/picture">
-            <wp:extent cx="5623560" cy="4010055"/>
+            <wp:extent cx="5623560" cy="4019214"/>
             <wp:docPr id="2" name="Picture 2" descr="Figure D7-2 | Spatiotemporal D7 structure and effective support."/>
             <wp:cNvGraphicFramePr>
               <a:graphicFrameLocks noChangeAspect="1"/>
@@ -1818,7 +1818,7 @@
                   <pic:spPr>
                     <a:xfrm>
                       <a:off x="0" y="0"/>
-                      <a:ext cx="5623560" cy="4010055"/>
+                      <a:ext cx="5623560" cy="4019214"/>
                     </a:xfrm>
                     <a:prstGeom prst="rect"/>
                   </pic:spPr>
@@ -1852,7 +1852,7 @@
       <w:r>
         <w:drawing>
           <wp:inline xmlns:a="http://schemas.openxmlformats.org/drawingml/2006/main" xmlns:pic="http://schemas.openxmlformats.org/drawingml/2006/picture">
-            <wp:extent cx="5623560" cy="3932264"/>
+            <wp:extent cx="5623560" cy="3935851"/>
             <wp:docPr id="3" name="Picture 3" descr="Figure D7-3 | Evidence decomposition, node influence and zone consensus."/>
             <wp:cNvGraphicFramePr>
               <a:graphicFrameLocks noChangeAspect="1"/>
@@ -1873,7 +1873,7 @@
                   <pic:spPr>
                     <a:xfrm>
                       <a:off x="0" y="0"/>
-                      <a:ext cx="5623560" cy="3932264"/>
+                      <a:ext cx="5623560" cy="3935851"/>
                     </a:xfrm>
                     <a:prstGeom prst="rect"/>
                   </pic:spPr>
@@ -1907,7 +1907,7 @@
       <w:r>
         <w:drawing>
           <wp:inline xmlns:a="http://schemas.openxmlformats.org/drawingml/2006/main" xmlns:pic="http://schemas.openxmlformats.org/drawingml/2006/picture">
-            <wp:extent cx="5623560" cy="4239772"/>
+            <wp:extent cx="5623560" cy="4242672"/>
             <wp:docPr id="4" name="Picture 4" descr="Figure D7-4 | Validation and Local-Sensitivity invariance."/>
             <wp:cNvGraphicFramePr>
               <a:graphicFrameLocks noChangeAspect="1"/>
@@ -1928,7 +1928,7 @@
                   <pic:spPr>
                     <a:xfrm>
                       <a:off x="0" y="0"/>
-                      <a:ext cx="5623560" cy="4239772"/>
+                      <a:ext cx="5623560" cy="4242672"/>
                     </a:xfrm>
                     <a:prstGeom prst="rect"/>
                   </pic:spPr>
@@ -2042,7 +2042,7 @@
           <w:color w:val="25282A"/>
           <w:sz w:val="20"/>
         </w:rPr>
-        <w:t>Effective support is inadequate for production gating in 53 of 56 templates.</w:t>
+        <w:t>Effective support is L1=48, L2=8, L3=0; only verified L3 may gate.</w:t>
       </w:r>
     </w:p>
     <w:p>
@@ -2056,7 +2056,7 @@
           <w:color w:val="25282A"/>
           <w:sz w:val="20"/>
         </w:rPr>
-        <w:t>Swap Top-1 is 0.75, below the 0.80 target.</w:t>
+        <w:t>Swap Top-1 is 0.70 (95% CI 0.57-0.80) versus the 0.80 target.</w:t>
       </w:r>
     </w:p>
     <w:p>
@@ -2070,7 +2070,7 @@
           <w:color w:val="25282A"/>
           <w:sz w:val="20"/>
         </w:rPr>
-        <w:t>The 499 candidate events lack external truth and cannot be called confirmed faults.</w:t>
+        <w:t>The 529 candidate events lack external truth and cannot be called confirmed faults.</w:t>
       </w:r>
     </w:p>
     <w:p>
@@ -2200,7 +2200,7 @@
         <w:color w:val="5F6B73"/>
         <w:sz w:val="16"/>
       </w:rPr>
-      <w:t>Generated 2026-07-22 17:24 CST | Research review only</w:t>
+      <w:t>Generated 2026-07-26 10:17 CST | Research review only</w:t>
     </w:r>
   </w:p>
 </w:ftr>

</xml_diff>

<commit_message>
Reclassify D7 topology evidence and gates
</commit_message>
<xml_diff>
--- a/Project 1 Data Quality Assessment/D7 Topological Role Consistency and Structural Representativeness/outputs/reports/D7_EXPERT_REPORT_v2.1.docx
+++ b/Project 1 Data Quality Assessment/D7 Topological Role Consistency and Structural Representativeness/outputs/reports/D7_EXPERT_REPORT_v2.1.docx
@@ -70,7 +70,7 @@
           <w:color w:val="25282A"/>
           <w:sz w:val="19"/>
         </w:rPr>
-        <w:t>D7-LOCAL-20260726T020233Z</w:t>
+        <w:t>D7-LOCAL-20260726T032027Z</w:t>
       </w:r>
     </w:p>
     <w:p>
@@ -131,7 +131,7 @@
           <w:color w:val="8B2E2E"/>
           <w:sz w:val="21"/>
         </w:rPr>
-        <w:t>Production release is blocked: topology/asset identity is unverified; support is L1=48, L2=8, L3=0; swap Top-1 is 0.70 (95% CI 0.57-0.80, n=60). D7_total, D7_forDQR and D6 final arbitration therefore remain empty.</w:t>
+        <w:t>Research topology is author-confirmed and reconciled to an installation register. Production release remains blocked by documentary approval, maintenance provenance and support/localization gates: L1=48, L2=8, L3=0; swap Top-1 is 0.70 (95% CI 0.57-0.80, n=60). D7_total, D7_forDQR and D6 final arbitration therefore remain empty.</w:t>
       </w:r>
     </w:p>
     <w:p>
@@ -1690,7 +1690,7 @@
           <w:color w:val="25282A"/>
           <w:sz w:val="20"/>
         </w:rPr>
-        <w:t>Topology drawing, coordinates, asset IDs, serial numbers and two-person approval remain pending.</w:t>
+        <w:t>Ordinal research topology is confirmed; maintenance provenance, production documentary audit and two-person approval remain pending.</w:t>
       </w:r>
     </w:p>
     <w:p>
@@ -1743,7 +1743,7 @@
         <w:drawing>
           <wp:inline xmlns:a="http://schemas.openxmlformats.org/drawingml/2006/main" xmlns:pic="http://schemas.openxmlformats.org/drawingml/2006/picture">
             <wp:extent cx="5623560" cy="2203810"/>
-            <wp:docPr id="1" name="Picture 1" descr="Figure D7-1 | Declared topology, applicability and release boundary."/>
+            <wp:docPr id="1" name="Picture 1" descr="Figure D7-1 | Author-confirmed topology, applicability and release boundary."/>
             <wp:cNvGraphicFramePr>
               <a:graphicFrameLocks noChangeAspect="1"/>
             </wp:cNvGraphicFramePr>
@@ -1786,7 +1786,7 @@
           <w:color w:val="5F6B73"/>
           <w:sz w:val="17"/>
         </w:rPr>
-        <w:t>Figure D7-1 | Declared topology, applicability and release boundary.</w:t>
+        <w:t>Figure D7-1 | Author-confirmed topology, applicability and release boundary.</w:t>
       </w:r>
     </w:p>
     <w:p>
@@ -2028,7 +2028,7 @@
           <w:color w:val="25282A"/>
           <w:sz w:val="20"/>
         </w:rPr>
-        <w:t>Field topology and asset identity are not verified or dual-approved.</w:t>
+        <w:t>Research topology is confirmed, but production documentary evidence and maintenance provenance are not dual-approved.</w:t>
       </w:r>
     </w:p>
     <w:p>
@@ -2042,7 +2042,7 @@
           <w:color w:val="25282A"/>
           <w:sz w:val="20"/>
         </w:rPr>
-        <w:t>Effective support is L1=48, L2=8, L3=0; only verified L3 may gate.</w:t>
+        <w:t>Effective support is L1=48, L2=8, L3=0; only production-approved L3 may gate.</w:t>
       </w:r>
     </w:p>
     <w:p>
@@ -2116,7 +2116,7 @@
           <w:color w:val="25282A"/>
           <w:sz w:val="20"/>
         </w:rPr>
-        <w:t>Complete field mapping and obtain two independent approvals.</w:t>
+        <w:t>Complete the maintenance/documentary audit and obtain two independent approvals.</w:t>
       </w:r>
     </w:p>
     <w:p>
@@ -2200,7 +2200,7 @@
         <w:color w:val="5F6B73"/>
         <w:sz w:val="16"/>
       </w:rPr>
-      <w:t>Generated 2026-07-26 10:17 CST | Research review only</w:t>
+      <w:t>Generated 2026-07-26 11:38 CST | Research review only</w:t>
     </w:r>
   </w:p>
 </w:ftr>

</xml_diff>